<commit_message>
update labs 6 and 7
</commit_message>
<xml_diff>
--- a/presentation/Version 2.0/Professional-Vue-v2.0.docx
+++ b/presentation/Version 2.0/Professional-Vue-v2.0.docx
@@ -7194,10 +7194,21 @@
       <w:bookmarkStart w:id="53" w:name="_Toc241675634"/>
       <w:r>
         <w:lastRenderedPageBreak/>
-        <w:t>Part 3: Using npm</w:t>
+        <w:t xml:space="preserve">Part </w:t>
+      </w:r>
+      <w:r>
+        <w:t>2</w:t>
+      </w:r>
+      <w:r>
+        <w:t xml:space="preserve">: Using </w:t>
+      </w:r>
+      <w:proofErr w:type="spellStart"/>
+      <w:r>
+        <w:t>npm</w:t>
       </w:r>
       <w:bookmarkEnd w:id="52"/>
       <w:bookmarkEnd w:id="53"/>
+      <w:proofErr w:type="spellEnd"/>
     </w:p>
     <w:p>
       <w:pPr>
@@ -7256,7 +7267,21 @@
         </w:rPr>
       </w:pPr>
       <w:r>
-        <w:t>Enter npm ls -g --depth=0</w:t>
+        <w:t xml:space="preserve">Enter </w:t>
+      </w:r>
+      <w:proofErr w:type="spellStart"/>
+      <w:r>
+        <w:rPr>
+          <w:rStyle w:val="CodeChar"/>
+        </w:rPr>
+        <w:t>npm</w:t>
+      </w:r>
+      <w:proofErr w:type="spellEnd"/>
+      <w:r>
+        <w:rPr>
+          <w:rStyle w:val="CodeChar"/>
+        </w:rPr>
+        <w:t xml:space="preserve"> ls -g --depth=0</w:t>
       </w:r>
     </w:p>
     <w:p>

</xml_diff>